<commit_message>
Fix cis/trans and E/Z drawings: assign double-bond stereo before depicting (cis was drawn as trans); redraw affected molecule, problem and question-bank images; rebuild Word docs and index
Co-Authored-By: Claude Sonnet 5.5 <noreply@anthropic.com>
Claude-Session: https://claude.ai/code/session_01Q567TpajQd7bmbFDieU89t
</commit_message>
<xml_diff>
--- a/organic-chemistry/word-docs/Ch05_Stereoisomerism_Answer_Key.docx
+++ b/organic-chemistry/word-docs/Ch05_Stereoisomerism_Answer_Key.docx
@@ -378,7 +378,7 @@
       <w:r>
         <w:drawing>
           <wp:inline xmlns:a="http://schemas.openxmlformats.org/drawingml/2006/main" xmlns:pic="http://schemas.openxmlformats.org/drawingml/2006/picture">
-            <wp:extent cx="4572000" cy="766405"/>
+            <wp:extent cx="4572000" cy="1293962"/>
             <wp:docPr id="1" name="Picture 1"/>
             <wp:cNvGraphicFramePr>
               <a:graphicFrameLocks noChangeAspect="1"/>
@@ -399,7 +399,7 @@
                   <pic:spPr>
                     <a:xfrm>
                       <a:off x="0" y="0"/>
-                      <a:ext cx="4572000" cy="766405"/>
+                      <a:ext cx="4572000" cy="1293962"/>
                     </a:xfrm>
                     <a:prstGeom prst="rect"/>
                   </pic:spPr>
@@ -4608,7 +4608,7 @@
       <w:r>
         <w:drawing>
           <wp:inline xmlns:a="http://schemas.openxmlformats.org/drawingml/2006/main" xmlns:pic="http://schemas.openxmlformats.org/drawingml/2006/picture">
-            <wp:extent cx="2279904" cy="1060704"/>
+            <wp:extent cx="1780032" cy="1645920"/>
             <wp:docPr id="6" name="Picture 6"/>
             <wp:cNvGraphicFramePr>
               <a:graphicFrameLocks noChangeAspect="1"/>
@@ -4629,7 +4629,7 @@
                   <pic:spPr>
                     <a:xfrm>
                       <a:off x="0" y="0"/>
-                      <a:ext cx="2279904" cy="1060704"/>
+                      <a:ext cx="1780032" cy="1645920"/>
                     </a:xfrm>
                     <a:prstGeom prst="rect"/>
                   </pic:spPr>
@@ -4732,7 +4732,7 @@
       <w:r>
         <w:drawing>
           <wp:inline xmlns:a="http://schemas.openxmlformats.org/drawingml/2006/main" xmlns:pic="http://schemas.openxmlformats.org/drawingml/2006/picture">
-            <wp:extent cx="4572000" cy="764931"/>
+            <wp:extent cx="4572000" cy="1288559"/>
             <wp:docPr id="7" name="Picture 7"/>
             <wp:cNvGraphicFramePr>
               <a:graphicFrameLocks noChangeAspect="1"/>
@@ -4753,7 +4753,7 @@
                   <pic:spPr>
                     <a:xfrm>
                       <a:off x="0" y="0"/>
-                      <a:ext cx="4572000" cy="764931"/>
+                      <a:ext cx="4572000" cy="1288559"/>
                     </a:xfrm>
                     <a:prstGeom prst="rect"/>
                   </pic:spPr>

</xml_diff>